<commit_message>
feat(resume-engine): on-demand pdf conversion, uploadthing caching, and auth redirect
</commit_message>
<xml_diff>
--- a/src/features/resume-engine/assets/cv-template-v2.docx
+++ b/src/features/resume-engine/assets/cv-template-v2.docx
@@ -1315,6 +1315,19 @@
               <w:t xml:space="preserve"> horas operativas al mes.</w:t>
             </w:r>
           </w:p>
+          <w:p>
+            <w:pPr>
+              <w:pStyle w:val="Prrafodelista"/>
+              <w:numPr>
+                <w:ilvl w:val="0"/>
+                <w:numId w:val="2"/>
+              </w:numPr>
+              <w:spacing w:after="50"/>
+            </w:pPr>
+            <w:r>
+              <w:t>Modelé la base de datos relacional en SQL Server e implementé control de acceso basado en roles (RBAC) y vistas de auditoría técnica, asegurando gobernanza e integridad de solicitudes.</w:t>
+            </w:r>
+          </w:p>
         </w:tc>
         <w:tc>
           <w:tcPr>
@@ -2724,7 +2737,7 @@
                       <w:iCs/>
                       <w:color w:val="475569"/>
                     </w:rPr>
-                    <w:t>Producto móvil: apps React Native con UX definido por diseño y entrega en Scrum.</w:t>
+                    <w:t>Ecosistema fintech cripto: apps React Native B2C y B2B (Telo Wallet y Telo Business mPOS) con WebSockets y pagos QR.</w:t>
                   </w:r>
                 </w:p>
               </w:tc>
@@ -2781,7 +2794,7 @@
               <w:spacing w:after="50"/>
             </w:pPr>
             <w:r>
-              <w:t>Entregué apps React Native con arquitectura offline-first y autenticación biométrica para operaciones de campo.</w:t>
+              <w:t>Desarrollé en React Native las aplicaciones móviles del ecosistema cripto: Telo Wallet (billetera B2C P2P) y Telo Business (mPOS para cobros comerciales QR).</w:t>
             </w:r>
           </w:p>
           <w:p>
@@ -2794,17 +2807,7 @@
               <w:spacing w:after="50"/>
             </w:pPr>
             <w:r>
-              <w:t xml:space="preserve">Implementé pruebas unitarias (Jest) y CI, reduciendo bugs en producción </w:t>
-            </w:r>
-            <w:r>
-              <w:rPr>
-                <w:b/>
-                <w:bCs/>
-              </w:rPr>
-              <w:t>~70%</w:t>
-            </w:r>
-            <w:r>
-              <w:t>.</w:t>
+              <w:t>Integré WebSockets (Socket.IO) para pagos en tiempo real, flujos QR dinámicos y pruebas con Jest reduciendo bugs ~70%.</w:t>
             </w:r>
           </w:p>
           <w:p>

</xml_diff>